<commit_message>
Updated thesis proposal and draft documents
</commit_message>
<xml_diff>
--- a/docs/Thesis version.docx
+++ b/docs/Thesis version.docx
@@ -278,7 +278,7 @@
           </mc:Choice>
           <mc:Fallback>
             <w:pict>
-              <v:line w14:anchorId="67A423C6" id="直线 11" o:spid="_x0000_s1026" style="position:absolute;flip:y;z-index:251654656;visibility:visible;mso-wrap-style:square;mso-wrap-distance-left:9pt;mso-wrap-distance-top:0;mso-wrap-distance-right:9pt;mso-wrap-distance-bottom:0;mso-position-horizontal:absolute;mso-position-horizontal-relative:text;mso-position-vertical:absolute;mso-position-vertical-relative:text" from="79.8pt,23.2pt" to="382.6pt,23.2pt" o:gfxdata="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">
+              <v:line w14:anchorId="4BD4EA20" id="直线 11" o:spid="_x0000_s1026" style="position:absolute;flip:y;z-index:251654656;visibility:visible;mso-wrap-style:square;mso-wrap-distance-left:9pt;mso-wrap-distance-top:0;mso-wrap-distance-right:9pt;mso-wrap-distance-bottom:0;mso-position-horizontal:absolute;mso-position-horizontal-relative:text;mso-position-vertical:absolute;mso-position-vertical-relative:text" from="79.8pt,23.2pt" to="382.6pt,23.2pt" o:gfxdata="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">
                 <v:stroke dashstyle="1 1"/>
               </v:line>
             </w:pict>
@@ -370,7 +370,7 @@
           </mc:Choice>
           <mc:Fallback>
             <w:pict>
-              <v:line w14:anchorId="1F7940BF" id="直线 12" o:spid="_x0000_s1026" style="position:absolute;flip:y;z-index:251655680;visibility:visible;mso-wrap-style:square;mso-wrap-distance-left:9pt;mso-wrap-distance-top:0;mso-wrap-distance-right:9pt;mso-wrap-distance-bottom:0;mso-position-horizontal:absolute;mso-position-horizontal-relative:text;mso-position-vertical:absolute;mso-position-vertical-relative:text" from="80.55pt,22pt" to="383.35pt,22pt" o:gfxdata="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">
+              <v:line w14:anchorId="27780384" id="直线 12" o:spid="_x0000_s1026" style="position:absolute;flip:y;z-index:251655680;visibility:visible;mso-wrap-style:square;mso-wrap-distance-left:9pt;mso-wrap-distance-top:0;mso-wrap-distance-right:9pt;mso-wrap-distance-bottom:0;mso-position-horizontal:absolute;mso-position-horizontal-relative:text;mso-position-vertical:absolute;mso-position-vertical-relative:text" from="80.55pt,22pt" to="383.35pt,22pt" o:gfxdata="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">
                 <v:stroke dashstyle="1 1"/>
               </v:line>
             </w:pict>
@@ -516,7 +516,7 @@
           </mc:Choice>
           <mc:Fallback>
             <w:pict>
-              <v:line w14:anchorId="01C52D67" id="直线 13" o:spid="_x0000_s1026" style="position:absolute;flip:y;z-index:251658752;visibility:visible;mso-wrap-style:square;mso-wrap-distance-left:9pt;mso-wrap-distance-top:0;mso-wrap-distance-right:9pt;mso-wrap-distance-bottom:0;mso-position-horizontal:absolute;mso-position-horizontal-relative:text;mso-position-vertical:absolute;mso-position-vertical-relative:text" from="103.8pt,21.75pt" to="377.25pt,21.75pt" o:gfxdata="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">
+              <v:line w14:anchorId="472CE1A9" id="直线 13" o:spid="_x0000_s1026" style="position:absolute;flip:y;z-index:251658752;visibility:visible;mso-wrap-style:square;mso-wrap-distance-left:9pt;mso-wrap-distance-top:0;mso-wrap-distance-right:9pt;mso-wrap-distance-bottom:0;mso-position-horizontal:absolute;mso-position-horizontal-relative:text;mso-position-vertical:absolute;mso-position-vertical-relative:text" from="103.8pt,21.75pt" to="377.25pt,21.75pt" o:gfxdata="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">
                 <v:stroke dashstyle="1 1"/>
               </v:line>
             </w:pict>
@@ -647,7 +647,7 @@
           </mc:Choice>
           <mc:Fallback>
             <w:pict>
-              <v:line w14:anchorId="3B06D411" id="直线 14" o:spid="_x0000_s1026" style="position:absolute;z-index:251659776;visibility:visible;mso-wrap-style:square;mso-wrap-distance-left:9pt;mso-wrap-distance-top:0;mso-wrap-distance-right:9pt;mso-wrap-distance-bottom:0;mso-position-horizontal:absolute;mso-position-horizontal-relative:text;mso-position-vertical:absolute;mso-position-vertical-relative:text" from="208.7pt,21pt" to="377.25pt,21pt" o:gfxdata="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">
+              <v:line w14:anchorId="13B240DA" id="直线 14" o:spid="_x0000_s1026" style="position:absolute;z-index:251659776;visibility:visible;mso-wrap-style:square;mso-wrap-distance-left:9pt;mso-wrap-distance-top:0;mso-wrap-distance-right:9pt;mso-wrap-distance-bottom:0;mso-position-horizontal:absolute;mso-position-horizontal-relative:text;mso-position-vertical:absolute;mso-position-vertical-relative:text" from="208.7pt,21pt" to="377.25pt,21pt" o:gfxdata="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">
                 <v:stroke dashstyle="1 1"/>
               </v:line>
             </w:pict>
@@ -752,7 +752,7 @@
           </mc:Choice>
           <mc:Fallback>
             <w:pict>
-              <v:line w14:anchorId="4D16931E" id="直线 15" o:spid="_x0000_s1026" style="position:absolute;z-index:251657728;visibility:visible;mso-wrap-style:square;mso-wrap-distance-left:9pt;mso-wrap-distance-top:0;mso-wrap-distance-right:9pt;mso-wrap-distance-bottom:0;mso-position-horizontal:absolute;mso-position-horizontal-relative:text;mso-position-vertical:absolute;mso-position-vertical-relative:text" from="99.2pt,21.75pt" to="377.25pt,21.75pt" o:gfxdata="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">
+              <v:line w14:anchorId="6F45FFA7" id="直线 15" o:spid="_x0000_s1026" style="position:absolute;z-index:251657728;visibility:visible;mso-wrap-style:square;mso-wrap-distance-left:9pt;mso-wrap-distance-top:0;mso-wrap-distance-right:9pt;mso-wrap-distance-bottom:0;mso-position-horizontal:absolute;mso-position-horizontal-relative:text;mso-position-vertical:absolute;mso-position-vertical-relative:text" from="99.2pt,21.75pt" to="377.25pt,21.75pt" o:gfxdata="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">
                 <v:stroke dashstyle="1 1"/>
               </v:line>
             </w:pict>
@@ -859,7 +859,7 @@
           </mc:Choice>
           <mc:Fallback>
             <w:pict>
-              <v:line w14:anchorId="54EB1B92" id="直线 16" o:spid="_x0000_s1026" style="position:absolute;z-index:251660800;visibility:visible;mso-wrap-style:square;mso-wrap-distance-left:9pt;mso-wrap-distance-top:0;mso-wrap-distance-right:9pt;mso-wrap-distance-bottom:0;mso-position-horizontal:absolute;mso-position-horizontal-relative:text;mso-position-vertical:absolute;mso-position-vertical-relative:text" from="111.75pt,21pt" to="377.25pt,21pt" o:gfxdata="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">
+              <v:line w14:anchorId="1B91117D" id="直线 16" o:spid="_x0000_s1026" style="position:absolute;z-index:251660800;visibility:visible;mso-wrap-style:square;mso-wrap-distance-left:9pt;mso-wrap-distance-top:0;mso-wrap-distance-right:9pt;mso-wrap-distance-bottom:0;mso-position-horizontal:absolute;mso-position-horizontal-relative:text;mso-position-vertical:absolute;mso-position-vertical-relative:text" from="111.75pt,21pt" to="377.25pt,21pt" o:gfxdata="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">
                 <v:stroke dashstyle="1 1"/>
               </v:line>
             </w:pict>
@@ -949,7 +949,7 @@
           </mc:Choice>
           <mc:Fallback>
             <w:pict>
-              <v:line w14:anchorId="0E45B3CF" id="直线 17" o:spid="_x0000_s1026" style="position:absolute;z-index:251656704;visibility:visible;mso-wrap-style:square;mso-wrap-distance-left:9pt;mso-wrap-distance-top:0;mso-wrap-distance-right:9pt;mso-wrap-distance-bottom:0;mso-position-horizontal:absolute;mso-position-horizontal-relative:text;mso-position-vertical:absolute;mso-position-vertical-relative:text" from="103.8pt,21.9pt" to="375.75pt,21.9pt" o:gfxdata="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">
+              <v:line w14:anchorId="734A5E05" id="直线 17" o:spid="_x0000_s1026" style="position:absolute;z-index:251656704;visibility:visible;mso-wrap-style:square;mso-wrap-distance-left:9pt;mso-wrap-distance-top:0;mso-wrap-distance-right:9pt;mso-wrap-distance-bottom:0;mso-position-horizontal:absolute;mso-position-horizontal-relative:text;mso-position-vertical:absolute;mso-position-vertical-relative:text" from="103.8pt,21.9pt" to="375.75pt,21.9pt" o:gfxdata="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">
                 <v:stroke dashstyle="1 1"/>
               </v:line>
             </w:pict>
@@ -1069,7 +1069,7 @@
           </mc:Choice>
           <mc:Fallback>
             <w:pict>
-              <v:line w14:anchorId="72FBC772" id="直线 18" o:spid="_x0000_s1026" style="position:absolute;z-index:251661824;visibility:visible;mso-wrap-style:square;mso-wrap-distance-left:9pt;mso-wrap-distance-top:0;mso-wrap-distance-right:9pt;mso-wrap-distance-bottom:0;mso-position-horizontal:absolute;mso-position-horizontal-relative:text;mso-position-vertical:absolute;mso-position-vertical-relative:text" from="106.85pt,21.45pt" to="375.75pt,21.45pt" o:gfxdata="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">
+              <v:line w14:anchorId="5C8C8EF1" id="直线 18" o:spid="_x0000_s1026" style="position:absolute;z-index:251661824;visibility:visible;mso-wrap-style:square;mso-wrap-distance-left:9pt;mso-wrap-distance-top:0;mso-wrap-distance-right:9pt;mso-wrap-distance-bottom:0;mso-position-horizontal:absolute;mso-position-horizontal-relative:text;mso-position-vertical:absolute;mso-position-vertical-relative:text" from="106.85pt,21.45pt" to="375.75pt,21.45pt" o:gfxdata="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">
                 <v:stroke dashstyle="1 1"/>
               </v:line>
             </w:pict>
@@ -1186,7 +1186,7 @@
           </mc:Choice>
           <mc:Fallback>
             <w:pict>
-              <v:line w14:anchorId="114A23B1" id="直线 19" o:spid="_x0000_s1026" style="position:absolute;z-index:251662848;visibility:visible;mso-wrap-style:square;mso-wrap-distance-left:9pt;mso-wrap-distance-top:0;mso-wrap-distance-right:9pt;mso-wrap-distance-bottom:0;mso-position-horizontal:absolute;mso-position-horizontal-relative:text;mso-position-vertical:absolute;mso-position-vertical-relative:text" from="164.5pt,21.05pt" to="332.8pt,21.05pt" o:gfxdata="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">
+              <v:line w14:anchorId="6F7A1D8F" id="直线 19" o:spid="_x0000_s1026" style="position:absolute;z-index:251662848;visibility:visible;mso-wrap-style:square;mso-wrap-distance-left:9pt;mso-wrap-distance-top:0;mso-wrap-distance-right:9pt;mso-wrap-distance-bottom:0;mso-position-horizontal:absolute;mso-position-horizontal-relative:text;mso-position-vertical:absolute;mso-position-vertical-relative:text" from="164.5pt,21.05pt" to="332.8pt,21.05pt" o:gfxdata="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">
                 <v:stroke dashstyle="1 1"/>
               </v:line>
             </w:pict>
@@ -1690,125 +1690,32 @@
     </w:p>
     <w:p>
       <w:pPr>
-        <w:autoSpaceDE w:val="0"/>
-        <w:autoSpaceDN w:val="0"/>
-        <w:adjustRightInd w:val="0"/>
-        <w:snapToGrid w:val="0"/>
-        <w:spacing w:line="400" w:lineRule="exact"/>
-        <w:ind w:right="28" w:firstLineChars="200" w:firstLine="643"/>
-        <w:rPr>
-          <w:rFonts w:ascii="SimHei" w:eastAsia="SimHei"/>
-          <w:sz w:val="32"/>
-          <w:szCs w:val="32"/>
-        </w:rPr>
-      </w:pPr>
-      <w:r>
-        <w:rPr>
-          <w:rFonts w:ascii="SimHei" w:eastAsia="SimHei" w:hint="eastAsia"/>
+        <w:jc w:val="center"/>
+      </w:pPr>
+      <w:r>
+        <w:rPr>
+          <w:rFonts w:ascii="SimHei" w:eastAsia="SimHei" w:hAnsi="SimHei"/>
           <w:b/>
           <w:sz w:val="32"/>
-          <w:szCs w:val="32"/>
-        </w:rPr>
-        <w:t>毕业论文的标题</w:t>
-      </w:r>
-      <w:r>
-        <w:rPr>
-          <w:rFonts w:eastAsia="Times New Roman" w:hint="eastAsia"/>
-          <w:color w:val="FF0000"/>
-          <w:szCs w:val="18"/>
-        </w:rPr>
-        <w:t>（Chinese title, Bold</w:t>
-      </w:r>
-      <w:r>
-        <w:rPr>
-          <w:rFonts w:eastAsiaTheme="minorEastAsia" w:hint="eastAsia"/>
-          <w:color w:val="FF0000"/>
-          <w:szCs w:val="18"/>
-        </w:rPr>
-        <w:t>face</w:t>
-      </w:r>
-      <w:r>
-        <w:rPr>
-          <w:rFonts w:eastAsiaTheme="minorEastAsia" w:hint="eastAsia"/>
-          <w:color w:val="FF0000"/>
-          <w:szCs w:val="18"/>
-        </w:rPr>
-        <w:t>黑体</w:t>
-      </w:r>
-      <w:r>
-        <w:rPr>
-          <w:rFonts w:eastAsiaTheme="minorEastAsia" w:hint="eastAsia"/>
-          <w:color w:val="FF0000"/>
-          <w:szCs w:val="18"/>
-        </w:rPr>
-        <w:t>, bold</w:t>
-      </w:r>
-      <w:r>
-        <w:rPr>
-          <w:rFonts w:eastAsia="Times New Roman" w:hint="eastAsia"/>
-          <w:color w:val="FF0000"/>
-          <w:szCs w:val="18"/>
-        </w:rPr>
-        <w:t>, size 16）</w:t>
-      </w:r>
-    </w:p>
-    <w:p>
-      <w:pPr>
-        <w:snapToGrid w:val="0"/>
-        <w:spacing w:beforeLines="100" w:before="312"/>
+        </w:rPr>
+        <w:t>主权债务的边际收益递减</w:t>
+      </w:r>
+    </w:p>
+    <w:p>
+      <w:pPr>
         <w:jc w:val="center"/>
-        <w:rPr>
-          <w:rFonts w:ascii="SimHei" w:eastAsia="SimHei"/>
+      </w:pPr>
+      <w:r>
+        <w:rPr>
+          <w:rFonts w:ascii="SimHei" w:eastAsia="SimHei" w:hAnsi="SimHei"/>
+          <w:b/>
           <w:sz w:val="28"/>
-          <w:szCs w:val="32"/>
-        </w:rPr>
-      </w:pPr>
-      <w:r>
-        <w:rPr>
-          <w:rFonts w:ascii="SimHei" w:eastAsia="SimHei" w:hint="eastAsia"/>
-          <w:sz w:val="28"/>
-          <w:szCs w:val="32"/>
-        </w:rPr>
-        <w:t>--副标题</w:t>
-      </w:r>
-      <w:r>
-        <w:rPr>
-          <w:rFonts w:eastAsia="Times New Roman" w:hint="eastAsia"/>
-          <w:color w:val="FF0000"/>
-          <w:szCs w:val="18"/>
-        </w:rPr>
-        <w:t xml:space="preserve">(bold, </w:t>
-      </w:r>
-      <w:r>
-        <w:rPr>
-          <w:rFonts w:eastAsiaTheme="minorEastAsia" w:hint="eastAsia"/>
-          <w:color w:val="FF0000"/>
-          <w:szCs w:val="18"/>
-        </w:rPr>
-        <w:t>黑体</w:t>
-      </w:r>
-      <w:r>
-        <w:rPr>
-          <w:rFonts w:eastAsia="Times New Roman" w:hint="eastAsia"/>
-          <w:color w:val="FF0000"/>
-          <w:szCs w:val="18"/>
-        </w:rPr>
-        <w:t>size 14)</w:t>
-      </w:r>
-    </w:p>
-    <w:p>
-      <w:pPr>
-        <w:spacing w:line="300" w:lineRule="auto"/>
-        <w:ind w:rightChars="12" w:right="25"/>
-        <w:rPr>
-          <w:rFonts w:ascii="Times" w:hAnsi="Times"/>
-          <w:b/>
-          <w:iCs/>
-          <w:color w:val="FF0000"/>
-          <w:sz w:val="32"/>
-          <w:szCs w:val="32"/>
-        </w:rPr>
-      </w:pPr>
+        </w:rPr>
+        <w:t>--动态机制与精英俘获</w:t>
+      </w:r>
+      <w:r>
+        <w:br/>
+      </w:r>
       <w:r>
         <w:rPr>
           <w:rFonts w:ascii="Times" w:hAnsi="Times" w:hint="eastAsia"/>
@@ -1904,157 +1811,28 @@
       </w:pPr>
     </w:p>
     <w:p>
-      <w:pPr>
-        <w:snapToGrid w:val="0"/>
-        <w:spacing w:line="400" w:lineRule="exact"/>
-        <w:ind w:rightChars="12" w:right="25" w:firstLineChars="200" w:firstLine="482"/>
-        <w:rPr>
-          <w:rFonts w:ascii="Times" w:hAnsi="Times"/>
-          <w:bCs/>
-          <w:color w:val="FF0000"/>
-          <w:sz w:val="22"/>
-        </w:rPr>
-      </w:pPr>
-      <w:r>
-        <w:rPr>
-          <w:rFonts w:ascii="Times" w:eastAsia="SimHei" w:hAnsi="SimHei" w:hint="eastAsia"/>
+      <w:r>
+        <w:rPr>
+          <w:rFonts w:ascii="SimHei" w:eastAsia="SimHei" w:hAnsi="SimHei"/>
           <w:b/>
           <w:sz w:val="24"/>
         </w:rPr>
-        <w:t>关键词</w:t>
-      </w:r>
-      <w:r>
-        <w:rPr>
-          <w:rFonts w:ascii="Times" w:eastAsia="SimHei" w:hAnsi="Times" w:hint="eastAsia"/>
-          <w:b/>
-          <w:sz w:val="24"/>
-        </w:rPr>
-        <w:t>(keywords)</w:t>
-      </w:r>
-      <w:r>
-        <w:rPr>
-          <w:rFonts w:hint="eastAsia"/>
-        </w:rPr>
-        <w:t xml:space="preserve"> </w:t>
-      </w:r>
-      <w:r>
-        <w:rPr>
-          <w:rFonts w:hint="eastAsia"/>
-          <w:color w:val="FF0000"/>
-        </w:rPr>
-        <w:t xml:space="preserve">(bold, </w:t>
-      </w:r>
-      <w:r>
-        <w:rPr>
-          <w:rFonts w:hint="eastAsia"/>
-          <w:color w:val="FF0000"/>
-        </w:rPr>
-        <w:t>黑体</w:t>
-      </w:r>
-      <w:r>
-        <w:rPr>
-          <w:rFonts w:hint="eastAsia"/>
-          <w:color w:val="FF0000"/>
-        </w:rPr>
-        <w:t>size 12)</w:t>
-      </w:r>
-      <w:r>
-        <w:rPr>
-          <w:rFonts w:ascii="Times" w:hint="eastAsia"/>
-          <w:b/>
-          <w:sz w:val="22"/>
-        </w:rPr>
-        <w:t>：</w:t>
-      </w:r>
-      <w:r>
-        <w:rPr>
-          <w:rFonts w:ascii="Times" w:hAnsi="Times" w:hint="eastAsia"/>
-          <w:color w:val="000000"/>
-          <w:sz w:val="24"/>
-          <w:szCs w:val="28"/>
-        </w:rPr>
-        <w:t xml:space="preserve">must be in consistent with the </w:t>
-      </w:r>
-      <w:r>
-        <w:rPr>
-          <w:rFonts w:ascii="Times" w:hAnsi="Times"/>
-          <w:color w:val="000000"/>
-          <w:sz w:val="24"/>
-          <w:szCs w:val="28"/>
-        </w:rPr>
-        <w:t>English</w:t>
-      </w:r>
-      <w:r>
-        <w:rPr>
-          <w:rFonts w:ascii="Times" w:hAnsi="Times" w:hint="eastAsia"/>
-          <w:color w:val="000000"/>
-          <w:sz w:val="24"/>
-          <w:szCs w:val="28"/>
-        </w:rPr>
-        <w:t xml:space="preserve"> one.</w:t>
-      </w:r>
-      <w:r>
+        <w:t>关键词(keywords)：</w:t>
+      </w:r>
+      <w:r>
+        <w:rPr>
+          <w:rFonts w:ascii="SimSun" w:hAnsi="SimSun"/>
+          <w:sz w:val="24"/>
+        </w:rPr>
+        <w:t>主权债务；精英俘获率；动态面板数据；宏观经济刺激；坎蒂隆效应。</w:t>
+      </w:r>
+    </w:p>
+    <w:p>
+      <w:pPr>
         <w:rPr>
           <w:rFonts w:ascii="Times" w:eastAsia="KaiTi_GB2312" w:hAnsi="Times" w:hint="eastAsia"/>
-          <w:sz w:val="22"/>
-        </w:rPr>
-        <w:t xml:space="preserve"> </w:t>
-      </w:r>
-    </w:p>
-    <w:p>
-      <w:pPr>
-        <w:rPr>
-          <w:rFonts w:ascii="Times" w:eastAsia="KaiTi_GB2312" w:hAnsi="Times"/>
-          <w:color w:val="FF0000"/>
-          <w:sz w:val="24"/>
-        </w:rPr>
-      </w:pPr>
-      <w:r>
-        <w:rPr>
-          <w:rFonts w:ascii="Times" w:eastAsia="KaiTi_GB2312" w:hAnsi="Times" w:hint="eastAsia"/>
-          <w:color w:val="FF0000"/>
-          <w:sz w:val="24"/>
-        </w:rPr>
-        <w:t>（宋体</w:t>
-      </w:r>
-      <w:r>
-        <w:rPr>
-          <w:rFonts w:ascii="Times" w:eastAsia="KaiTi_GB2312" w:hAnsi="Times" w:hint="eastAsia"/>
-          <w:color w:val="FF0000"/>
-          <w:sz w:val="24"/>
-        </w:rPr>
-        <w:t>Song typeface</w:t>
-      </w:r>
-      <w:r>
-        <w:rPr>
-          <w:rFonts w:ascii="Times" w:eastAsia="KaiTi_GB2312" w:hAnsi="Times" w:hint="eastAsia"/>
-          <w:color w:val="FF0000"/>
-          <w:sz w:val="24"/>
-        </w:rPr>
-        <w:t>，</w:t>
-      </w:r>
-      <w:r>
-        <w:rPr>
-          <w:rFonts w:ascii="Times" w:eastAsia="KaiTi_GB2312" w:hAnsi="Times" w:hint="eastAsia"/>
-          <w:color w:val="FF0000"/>
-          <w:sz w:val="24"/>
-        </w:rPr>
-        <w:t>size12</w:t>
-      </w:r>
-      <w:r>
-        <w:rPr>
-          <w:rFonts w:ascii="Times" w:eastAsia="KaiTi_GB2312" w:hAnsi="Times" w:hint="eastAsia"/>
-          <w:color w:val="FF0000"/>
-          <w:sz w:val="24"/>
-        </w:rPr>
-        <w:t>）</w:t>
-      </w:r>
-    </w:p>
-    <w:p>
-      <w:pPr>
-        <w:rPr>
-          <w:color w:val="000000"/>
-          <w:sz w:val="36"/>
+          <w:color w:val="FF0000"/>
+          <w:sz w:val="24"/>
         </w:rPr>
         <w:sectPr>
           <w:pgSz w:w="11906" w:h="16838"/>
@@ -2098,15 +1876,6 @@
       <w:bookmarkEnd w:id="6"/>
       <w:bookmarkEnd w:id="7"/>
       <w:r>
-        <w:rPr>
-          <w:rFonts w:hint="eastAsia"/>
-          <w:b w:val="0"/>
-          <w:color w:val="FF0000"/>
-          <w:sz w:val="24"/>
-        </w:rPr>
-        <w:t>(times new romar, font size 18, bold)</w:t>
-      </w:r>
-      <w:r>
         <w:fldChar w:fldCharType="begin"/>
       </w:r>
       <w:r>
@@ -2123,24 +1892,6 @@
       </w:r>
       <w:r>
         <w:fldChar w:fldCharType="separate"/>
-      </w:r>
-    </w:p>
-    <w:p>
-      <w:pPr>
-        <w:snapToGrid w:val="0"/>
-        <w:spacing w:line="360" w:lineRule="auto"/>
-        <w:rPr>
-          <w:color w:val="FF0000"/>
-          <w:sz w:val="24"/>
-        </w:rPr>
-      </w:pPr>
-      <w:r>
-        <w:rPr>
-          <w:rFonts w:hint="eastAsia"/>
-          <w:color w:val="FF0000"/>
-          <w:sz w:val="24"/>
-        </w:rPr>
-        <w:t>(times new romar, size 12; )</w:t>
       </w:r>
     </w:p>
     <w:p>
@@ -2152,6 +1903,7 @@
         <w:snapToGrid w:val="0"/>
         <w:spacing w:line="360" w:lineRule="auto"/>
         <w:rPr>
+          <w:rFonts w:hint="eastAsia"/>
           <w:sz w:val="24"/>
         </w:rPr>
       </w:pPr>
@@ -3441,44 +3193,57 @@
         </w:rPr>
         <w:t>Acknowledge</w:t>
       </w:r>
-      <w:hyperlink w:anchor="_Toc28420" w:history="1">
-        <w:r>
-          <w:rPr>
-            <w:sz w:val="24"/>
-          </w:rPr>
-          <w:tab/>
-        </w:r>
-        <w:r>
-          <w:rPr>
-            <w:sz w:val="24"/>
-          </w:rPr>
-          <w:fldChar w:fldCharType="begin"/>
-        </w:r>
-        <w:r>
-          <w:rPr>
-            <w:sz w:val="24"/>
-          </w:rPr>
-          <w:instrText xml:space="preserve"> PAGEREF _Toc28420 </w:instrText>
-        </w:r>
-        <w:r>
-          <w:rPr>
-            <w:sz w:val="24"/>
-          </w:rPr>
-          <w:fldChar w:fldCharType="separate"/>
-        </w:r>
-        <w:r>
-          <w:rPr>
-            <w:sz w:val="24"/>
-          </w:rPr>
-          <w:t>22</w:t>
-        </w:r>
-        <w:r>
-          <w:rPr>
-            <w:sz w:val="24"/>
-          </w:rPr>
-          <w:fldChar w:fldCharType="end"/>
-        </w:r>
-      </w:hyperlink>
+      <w:r>
+        <w:fldChar w:fldCharType="begin"/>
+      </w:r>
+      <w:r>
+        <w:instrText xml:space="preserve"> HYPERLINK \l "_Toc28420" </w:instrText>
+      </w:r>
+      <w:r>
+        <w:fldChar w:fldCharType="separate"/>
+      </w:r>
+      <w:r>
+        <w:rPr>
+          <w:sz w:val="24"/>
+        </w:rPr>
+        <w:tab/>
+      </w:r>
+      <w:r>
+        <w:rPr>
+          <w:sz w:val="24"/>
+        </w:rPr>
+        <w:fldChar w:fldCharType="begin"/>
+      </w:r>
+      <w:r>
+        <w:rPr>
+          <w:sz w:val="24"/>
+        </w:rPr>
+        <w:instrText xml:space="preserve"> PAGEREF _Toc28420 </w:instrText>
+      </w:r>
+      <w:r>
+        <w:rPr>
+          <w:sz w:val="24"/>
+        </w:rPr>
+        <w:fldChar w:fldCharType="separate"/>
+      </w:r>
+      <w:r>
+        <w:rPr>
+          <w:sz w:val="24"/>
+        </w:rPr>
+        <w:t>22</w:t>
+      </w:r>
+      <w:r>
+        <w:rPr>
+          <w:sz w:val="24"/>
+        </w:rPr>
+        <w:fldChar w:fldCharType="end"/>
+      </w:r>
+      <w:r>
+        <w:rPr>
+          <w:sz w:val="24"/>
+        </w:rPr>
+        <w:fldChar w:fldCharType="end"/>
+      </w:r>
     </w:p>
     <w:p>
       <w:pPr>
@@ -5111,7 +4876,7 @@
           <w:noProof/>
           <w:position w:val="-60"/>
         </w:rPr>
-        <w:object w:dxaOrig="1875" w:dyaOrig="1005" w14:anchorId="2D133DE1">
+        <w:object w:dxaOrig="1875" w:dyaOrig="1005" w14:anchorId="0D83746C">
           <v:shapetype id="_x0000_t75" coordsize="21600,21600" o:spt="75" o:preferrelative="t" path="m@4@5l@4@11@9@11@9@5xe" filled="f" stroked="f">
             <v:stroke joinstyle="miter"/>
             <v:formulas>
@@ -5134,7 +4899,7 @@
           <v:shape id="_x0000_i1025" type="#_x0000_t75" alt="" style="width:94pt;height:50pt;mso-width-percent:0;mso-height-percent:0;mso-width-percent:0;mso-height-percent:0" o:ole="">
             <v:imagedata r:id="rId13" o:title=""/>
           </v:shape>
-          <o:OLEObject Type="Embed" ProgID="Equation.3" ShapeID="_x0000_i1025" DrawAspect="Content" ObjectID="_1839565696" r:id="rId14"/>
+          <o:OLEObject Type="Embed" ProgID="Equation.3" ShapeID="_x0000_i1025" DrawAspect="Content" ObjectID="_1839569667" r:id="rId14"/>
         </w:object>
       </w:r>
       <w:r>

</xml_diff>